<commit_message>
new SA and addendum
</commit_message>
<xml_diff>
--- a/corporate-partners-appendix/modules/mentors/attachments/addendum.docx
+++ b/corporate-partners-appendix/modules/mentors/attachments/addendum.docx
@@ -1871,24 +1871,6 @@
           <w:rFonts w:ascii="Times New Roman" w:hAnsi="Times New Roman" w:cs="Times New Roman"/>
         </w:rPr>
         <w:t xml:space="preserve"> (self-selected), plus 1 TA</w:t>
-      </w:r>
-    </w:p>
-    <w:p>
-      <w:pPr>
-        <w:pStyle w:val="ListParagraph"/>
-        <w:numPr>
-          <w:ilvl w:val="0"/>
-          <w:numId w:val="6"/>
-        </w:numPr>
-        <w:rPr>
-          <w:rFonts w:ascii="Times New Roman" w:hAnsi="Times New Roman" w:cs="Times New Roman"/>
-        </w:rPr>
-      </w:pPr>
-      <w:r>
-        <w:rPr>
-          <w:rFonts w:ascii="Times New Roman" w:hAnsi="Times New Roman" w:cs="Times New Roman"/>
-        </w:rPr>
-        <w:t>Access to Data Mine Resume Book</w:t>
       </w:r>
     </w:p>
     <w:p>
@@ -8795,7 +8777,15 @@
           <w:b/>
           <w:spacing w:val="-2"/>
         </w:rPr>
-        <w:t xml:space="preserve"> Stacey Dunderman </w:t>
+        <w:t xml:space="preserve"> </w:t>
+      </w:r>
+      <w:r>
+        <w:rPr>
+          <w:rFonts w:ascii="Times New Roman" w:hAnsi="Times New Roman" w:cs="Times New Roman"/>
+          <w:b/>
+          <w:spacing w:val="-2"/>
+        </w:rPr>
+        <w:t xml:space="preserve">Katie Sanders </w:t>
       </w:r>
       <w:hyperlink r:id="rId9" w:history="1">
         <w:r>
@@ -8805,7 +8795,7 @@
             <w:b/>
             <w:spacing w:val="-2"/>
           </w:rPr>
-          <w:t>sdunderm@purdue.edu</w:t>
+          <w:t>kmpechin@gmail.com</w:t>
         </w:r>
       </w:hyperlink>
       <w:r>
@@ -8813,13 +8803,6 @@
           <w:rFonts w:ascii="Times New Roman" w:hAnsi="Times New Roman" w:cs="Times New Roman"/>
           <w:b/>
           <w:spacing w:val="-2"/>
-        </w:rPr>
-        <w:t xml:space="preserve">. </w:t>
-      </w:r>
-      <w:r>
-        <w:rPr>
-          <w:rFonts w:ascii="Times New Roman" w:hAnsi="Times New Roman" w:cs="Times New Roman"/>
-          <w:b/>
         </w:rPr>
         <w:t xml:space="preserve"> </w:t>
       </w:r>
@@ -10032,7 +10015,7 @@
               <w:rPr>
                 <w:rFonts w:ascii="Times New Roman" w:hAnsi="Times New Roman" w:cs="Times New Roman"/>
               </w:rPr>
-              <w:t>January 8, 2026</w:t>
+              <w:t>June 19, 2026</w:t>
             </w:r>
           </w:p>
         </w:sdtContent>

</xml_diff>